<commit_message>
simulation v1 plus bug fixes. wip.
</commit_message>
<xml_diff>
--- a/documents/Week11-AI-Logs.docx
+++ b/documents/Week11-AI-Logs.docx
@@ -485,6 +485,119 @@
                 <w:szCs w:val="24"/>
               </w:rPr>
               <w:t>This file builds out a PRD file for me by scanning the repository for context. I used this to build the first two versions of the PRD. This includes a risk report, requirements and software versions.</w:t>
+            </w:r>
+          </w:p>
+        </w:tc>
+      </w:tr>
+      <w:tr>
+        <w:tc>
+          <w:tcPr>
+            <w:tcW w:w="2236" w:type="dxa"/>
+          </w:tcPr>
+          <w:p>
+            <w:pPr>
+              <w:spacing w:line="480" w:lineRule="auto"/>
+              <w:rPr>
+                <w:rFonts w:cs="Times New Roman"/>
+                <w:bCs/>
+                <w:szCs w:val="24"/>
+              </w:rPr>
+            </w:pPr>
+            <w:r>
+              <w:rPr>
+                <w:rFonts w:cs="Times New Roman"/>
+                <w:bCs/>
+                <w:szCs w:val="24"/>
+              </w:rPr>
+              <w:t>Gemini</w:t>
+            </w:r>
+          </w:p>
+        </w:tc>
+        <w:tc>
+          <w:tcPr>
+            <w:tcW w:w="999" w:type="dxa"/>
+          </w:tcPr>
+          <w:p>
+            <w:pPr>
+              <w:spacing w:line="480" w:lineRule="auto"/>
+              <w:rPr>
+                <w:rFonts w:cs="Times New Roman"/>
+                <w:bCs/>
+                <w:szCs w:val="24"/>
+              </w:rPr>
+            </w:pPr>
+            <w:r>
+              <w:rPr>
+                <w:rFonts w:cs="Times New Roman"/>
+                <w:bCs/>
+                <w:szCs w:val="24"/>
+              </w:rPr>
+              <w:t>7/24</w:t>
+            </w:r>
+          </w:p>
+        </w:tc>
+        <w:tc>
+          <w:tcPr>
+            <w:tcW w:w="2790" w:type="dxa"/>
+          </w:tcPr>
+          <w:p>
+            <w:pPr>
+              <w:spacing w:line="480" w:lineRule="auto"/>
+              <w:rPr>
+                <w:rFonts w:cs="Times New Roman"/>
+                <w:bCs/>
+                <w:szCs w:val="24"/>
+              </w:rPr>
+            </w:pPr>
+            <w:r>
+              <w:rPr>
+                <w:rFonts w:cs="Times New Roman"/>
+                <w:bCs/>
+                <w:szCs w:val="24"/>
+              </w:rPr>
+              <w:t xml:space="preserve">can a local variable be garbage collected in </w:t>
+            </w:r>
+            <w:r>
+              <w:rPr>
+                <w:rFonts w:cs="Times New Roman"/>
+                <w:bCs/>
+                <w:szCs w:val="24"/>
+              </w:rPr>
+              <w:lastRenderedPageBreak/>
+              <w:t>python before the function finishes</w:t>
+            </w:r>
+          </w:p>
+        </w:tc>
+        <w:tc>
+          <w:tcPr>
+            <w:tcW w:w="3325" w:type="dxa"/>
+          </w:tcPr>
+          <w:p>
+            <w:pPr>
+              <w:spacing w:line="480" w:lineRule="auto"/>
+              <w:rPr>
+                <w:rFonts w:cs="Times New Roman"/>
+                <w:bCs/>
+                <w:szCs w:val="24"/>
+              </w:rPr>
+            </w:pPr>
+            <w:r>
+              <w:rPr>
+                <w:rFonts w:cs="Times New Roman"/>
+                <w:bCs/>
+                <w:szCs w:val="24"/>
+              </w:rPr>
+              <w:lastRenderedPageBreak/>
+              <w:t xml:space="preserve">I encountered an unbound var error in my code. I wanted to make sure that the value could </w:t>
+            </w:r>
+            <w:r>
+              <w:rPr>
+                <w:rFonts w:cs="Times New Roman"/>
+                <w:bCs/>
+                <w:szCs w:val="24"/>
+              </w:rPr>
+              <w:lastRenderedPageBreak/>
+              <w:t>not be garbage collected before the value gets used.</w:t>
             </w:r>
           </w:p>
         </w:tc>

</xml_diff>

<commit_message>
update to week 11 AI log
</commit_message>
<xml_diff>
--- a/documents/Week11-AI-Logs.docx
+++ b/documents/Week11-AI-Logs.docx
@@ -485,6 +485,157 @@
                 <w:szCs w:val="24"/>
               </w:rPr>
               <w:t>This file builds out a PRD file for me by scanning the repository for context. I used this to build the first two versions of the PRD. This includes a risk report, requirements and software versions.</w:t>
+            </w:r>
+          </w:p>
+        </w:tc>
+      </w:tr>
+      <w:tr>
+        <w:tc>
+          <w:tcPr>
+            <w:tcW w:w="2236" w:type="dxa"/>
+          </w:tcPr>
+          <w:p>
+            <w:pPr>
+              <w:spacing w:line="480" w:lineRule="auto"/>
+              <w:rPr>
+                <w:rFonts w:cs="Times New Roman"/>
+                <w:bCs/>
+                <w:szCs w:val="24"/>
+              </w:rPr>
+            </w:pPr>
+            <w:r>
+              <w:rPr>
+                <w:rFonts w:cs="Times New Roman"/>
+                <w:bCs/>
+                <w:szCs w:val="24"/>
+              </w:rPr>
+              <w:t>Copilot</w:t>
+            </w:r>
+          </w:p>
+        </w:tc>
+        <w:tc>
+          <w:tcPr>
+            <w:tcW w:w="999" w:type="dxa"/>
+          </w:tcPr>
+          <w:p>
+            <w:pPr>
+              <w:spacing w:line="480" w:lineRule="auto"/>
+              <w:rPr>
+                <w:rFonts w:cs="Times New Roman"/>
+                <w:bCs/>
+                <w:szCs w:val="24"/>
+              </w:rPr>
+            </w:pPr>
+            <w:r>
+              <w:rPr>
+                <w:rFonts w:cs="Times New Roman"/>
+                <w:bCs/>
+                <w:szCs w:val="24"/>
+              </w:rPr>
+              <w:t>7/25</w:t>
+            </w:r>
+          </w:p>
+        </w:tc>
+        <w:tc>
+          <w:tcPr>
+            <w:tcW w:w="2790" w:type="dxa"/>
+          </w:tcPr>
+          <w:p>
+            <w:pPr>
+              <w:spacing w:line="480" w:lineRule="auto"/>
+              <w:rPr>
+                <w:rFonts w:cs="Times New Roman"/>
+                <w:bCs/>
+                <w:szCs w:val="24"/>
+              </w:rPr>
+            </w:pPr>
+            <w:r>
+              <w:rPr>
+                <w:rFonts w:cs="Times New Roman"/>
+                <w:bCs/>
+                <w:szCs w:val="24"/>
+              </w:rPr>
+              <w:t>follow all instructions in /generate-prd</w:t>
+            </w:r>
+          </w:p>
+          <w:p>
+            <w:pPr>
+              <w:spacing w:line="480" w:lineRule="auto"/>
+              <w:rPr>
+                <w:rFonts w:cs="Times New Roman"/>
+                <w:bCs/>
+                <w:szCs w:val="24"/>
+              </w:rPr>
+            </w:pPr>
+            <w:r>
+              <w:rPr>
+                <w:rFonts w:cs="Times New Roman"/>
+                <w:bCs/>
+                <w:szCs w:val="24"/>
+              </w:rPr>
+              <w:lastRenderedPageBreak/>
+              <w:t>Analyze sections 1. product vision and section 2. Product Scope for changes to the document. Make sure thoes changes are reflected in future sections.</w:t>
+            </w:r>
+          </w:p>
+          <w:p>
+            <w:pPr>
+              <w:spacing w:line="480" w:lineRule="auto"/>
+              <w:rPr>
+                <w:rFonts w:cs="Times New Roman"/>
+                <w:bCs/>
+                <w:szCs w:val="24"/>
+              </w:rPr>
+            </w:pPr>
+            <w:r>
+              <w:rPr>
+                <w:rFonts w:cs="Times New Roman"/>
+                <w:bCs/>
+                <w:szCs w:val="24"/>
+              </w:rPr>
+              <w:t>Do not make changes to sections 1, 2, or files outside of PRD.md.</w:t>
+            </w:r>
+          </w:p>
+          <w:p>
+            <w:pPr>
+              <w:spacing w:line="480" w:lineRule="auto"/>
+              <w:rPr>
+                <w:rFonts w:cs="Times New Roman"/>
+                <w:bCs/>
+                <w:szCs w:val="24"/>
+              </w:rPr>
+            </w:pPr>
+          </w:p>
+        </w:tc>
+        <w:tc>
+          <w:tcPr>
+            <w:tcW w:w="3325" w:type="dxa"/>
+          </w:tcPr>
+          <w:p>
+            <w:pPr>
+              <w:spacing w:line="480" w:lineRule="auto"/>
+              <w:rPr>
+                <w:rFonts w:cs="Times New Roman"/>
+                <w:bCs/>
+                <w:szCs w:val="24"/>
+              </w:rPr>
+            </w:pPr>
+            <w:r>
+              <w:rPr>
+                <w:rFonts w:cs="Times New Roman"/>
+                <w:bCs/>
+                <w:szCs w:val="24"/>
+              </w:rPr>
+              <w:lastRenderedPageBreak/>
+              <w:t xml:space="preserve">I used this command to update the PRD after I made changes to sections 1 and 2. This was </w:t>
+            </w:r>
+            <w:r>
+              <w:rPr>
+                <w:rFonts w:cs="Times New Roman"/>
+                <w:bCs/>
+                <w:szCs w:val="24"/>
+              </w:rPr>
+              <w:lastRenderedPageBreak/>
+              <w:t>done to make sure that future sections reflected the true intentions of the project</w:t>
             </w:r>
           </w:p>
         </w:tc>
@@ -1277,7 +1428,6 @@
   <w:style w:type="character" w:default="1" w:styleId="DefaultParagraphFont">
     <w:name w:val="Default Paragraph Font"/>
     <w:uiPriority w:val="1"/>
-    <w:semiHidden/>
     <w:unhideWhenUsed/>
   </w:style>
   <w:style w:type="table" w:default="1" w:styleId="TableNormal">

</xml_diff>